<commit_message>
Update Relatório One Time Passwords.docx
</commit_message>
<xml_diff>
--- a/Relatório One Time Passwords.docx
+++ b/Relatório One Time Passwords.docx
@@ -506,7 +506,6 @@
           <w:szCs w:val="14"/>
         </w:rPr>
       </w:pPr>
-      <w:proofErr w:type="spellStart"/>
       <w:r>
         <w:rPr>
           <w:rFonts w:ascii="Arial" w:eastAsia="Arial" w:hAnsi="Arial" w:cs="Arial"/>
@@ -514,17 +513,7 @@
           <w:color w:val="000000" w:themeColor="text1"/>
           <w:sz w:val="36"/>
         </w:rPr>
-        <w:t>One</w:t>
-      </w:r>
-      <w:proofErr w:type="spellEnd"/>
-      <w:r>
-        <w:rPr>
-          <w:rFonts w:ascii="Arial" w:eastAsia="Arial" w:hAnsi="Arial" w:cs="Arial"/>
-          <w:b/>
-          <w:color w:val="000000" w:themeColor="text1"/>
-          <w:sz w:val="36"/>
-        </w:rPr>
-        <w:t xml:space="preserve"> Time Passwords (OTP)</w:t>
+        <w:t>One Time Passwords (OTP)</w:t>
       </w:r>
     </w:p>
     <w:p>
@@ -741,18 +730,8 @@
           <w:sz w:val="22"/>
           <w:szCs w:val="22"/>
         </w:rPr>
-        <w:t xml:space="preserve">          Nuno </w:t>
-      </w:r>
-      <w:proofErr w:type="spellStart"/>
-      <w:r>
-        <w:rPr>
-          <w:rFonts w:ascii="Arial" w:eastAsia="Arial" w:hAnsi="Arial" w:cs="Arial"/>
-          <w:sz w:val="22"/>
-          <w:szCs w:val="22"/>
-        </w:rPr>
-        <w:t>Fonsenca</w:t>
-      </w:r>
-      <w:proofErr w:type="spellEnd"/>
+        <w:t xml:space="preserve">          Nuno Fonsenca</w:t>
+      </w:r>
     </w:p>
     <w:p>
       <w:pPr>
@@ -962,18 +941,8 @@
           <w:szCs w:val="22"/>
           <w:u w:val="single"/>
         </w:rPr>
-        <w:t xml:space="preserve">2.2. Criptografia Simétrica e </w:t>
-      </w:r>
-      <w:proofErr w:type="spellStart"/>
-      <w:r>
-        <w:rPr>
-          <w:sz w:val="22"/>
-          <w:szCs w:val="22"/>
-          <w:u w:val="single"/>
-        </w:rPr>
-        <w:t>Hashing</w:t>
-      </w:r>
-      <w:proofErr w:type="spellEnd"/>
+        <w:t>2.2. Criptografia Simétrica e Hashing</w:t>
+      </w:r>
     </w:p>
     <w:p>
       <w:pPr>
@@ -1052,25 +1021,25 @@
           <w:szCs w:val="22"/>
           <w:u w:val="single"/>
         </w:rPr>
-        <w:t xml:space="preserve">3.1. </w:t>
-      </w:r>
-      <w:proofErr w:type="spellStart"/>
-      <w:r>
+        <w:t>3.1. Tokens de Hardware</w:t>
+      </w:r>
+    </w:p>
+    <w:p>
+      <w:pPr>
+        <w:jc w:val="center"/>
         <w:rPr>
           <w:sz w:val="22"/>
           <w:szCs w:val="22"/>
           <w:u w:val="single"/>
         </w:rPr>
-        <w:t>Tokens</w:t>
-      </w:r>
-      <w:proofErr w:type="spellEnd"/>
+      </w:pPr>
       <w:r>
         <w:rPr>
           <w:sz w:val="22"/>
           <w:szCs w:val="22"/>
           <w:u w:val="single"/>
         </w:rPr>
-        <w:t xml:space="preserve"> de Hardware</w:t>
+        <w:t>3.2. SMS (Short Message Service)</w:t>
       </w:r>
     </w:p>
     <w:p>
@@ -1088,108 +1057,26 @@
           <w:szCs w:val="22"/>
           <w:u w:val="single"/>
         </w:rPr>
-        <w:t xml:space="preserve">3.2. SMS (Short </w:t>
-      </w:r>
-      <w:proofErr w:type="spellStart"/>
-      <w:r>
+        <w:t>3.3. Aplicações Autenticadoras (Soft Tokens)</w:t>
+      </w:r>
+    </w:p>
+    <w:p>
+      <w:pPr>
+        <w:jc w:val="center"/>
         <w:rPr>
           <w:sz w:val="22"/>
           <w:szCs w:val="22"/>
           <w:u w:val="single"/>
         </w:rPr>
-        <w:t>Message</w:t>
-      </w:r>
-      <w:proofErr w:type="spellEnd"/>
+      </w:pPr>
       <w:r>
         <w:rPr>
           <w:sz w:val="22"/>
           <w:szCs w:val="22"/>
           <w:u w:val="single"/>
         </w:rPr>
-        <w:t xml:space="preserve"> </w:t>
-      </w:r>
-      <w:proofErr w:type="spellStart"/>
-      <w:r>
-        <w:rPr>
-          <w:sz w:val="22"/>
-          <w:szCs w:val="22"/>
-          <w:u w:val="single"/>
-        </w:rPr>
-        <w:t>Service</w:t>
-      </w:r>
-      <w:proofErr w:type="spellEnd"/>
-      <w:r>
-        <w:rPr>
-          <w:sz w:val="22"/>
-          <w:szCs w:val="22"/>
-          <w:u w:val="single"/>
-        </w:rPr>
-        <w:t>)</w:t>
-      </w:r>
-    </w:p>
-    <w:p>
-      <w:pPr>
-        <w:jc w:val="center"/>
-        <w:rPr>
-          <w:sz w:val="22"/>
-          <w:szCs w:val="22"/>
-          <w:u w:val="single"/>
-        </w:rPr>
-      </w:pPr>
-      <w:r>
-        <w:rPr>
-          <w:sz w:val="22"/>
-          <w:szCs w:val="22"/>
-          <w:u w:val="single"/>
-        </w:rPr>
-        <w:t xml:space="preserve">3.3. Aplicações Autenticadoras (Soft </w:t>
-      </w:r>
-      <w:proofErr w:type="spellStart"/>
-      <w:r>
-        <w:rPr>
-          <w:sz w:val="22"/>
-          <w:szCs w:val="22"/>
-          <w:u w:val="single"/>
-        </w:rPr>
-        <w:t>Tokens</w:t>
-      </w:r>
-      <w:proofErr w:type="spellEnd"/>
-      <w:r>
-        <w:rPr>
-          <w:sz w:val="22"/>
-          <w:szCs w:val="22"/>
-          <w:u w:val="single"/>
-        </w:rPr>
-        <w:t>)</w:t>
-      </w:r>
-    </w:p>
-    <w:p>
-      <w:pPr>
-        <w:jc w:val="center"/>
-        <w:rPr>
-          <w:sz w:val="22"/>
-          <w:szCs w:val="22"/>
-          <w:u w:val="single"/>
-        </w:rPr>
-      </w:pPr>
-      <w:r>
-        <w:rPr>
-          <w:sz w:val="22"/>
-          <w:szCs w:val="22"/>
-          <w:u w:val="single"/>
-        </w:rPr>
-        <w:t xml:space="preserve">3.4. E-mail e Push </w:t>
-      </w:r>
-      <w:proofErr w:type="spellStart"/>
-      <w:r>
-        <w:rPr>
-          <w:sz w:val="22"/>
-          <w:szCs w:val="22"/>
-          <w:u w:val="single"/>
-        </w:rPr>
-        <w:t>Notifications</w:t>
-      </w:r>
-      <w:proofErr w:type="spellEnd"/>
+        <w:t>3.4. E-mail e Push Notifications</w:t>
+      </w:r>
     </w:p>
     <w:p>
       <w:pPr>
@@ -1228,18 +1115,8 @@
           <w:szCs w:val="22"/>
           <w:u w:val="single"/>
         </w:rPr>
-        <w:t xml:space="preserve">4.1. Ataques de Engenharia Social e </w:t>
-      </w:r>
-      <w:proofErr w:type="spellStart"/>
-      <w:r>
-        <w:rPr>
-          <w:sz w:val="22"/>
-          <w:szCs w:val="22"/>
-          <w:u w:val="single"/>
-        </w:rPr>
-        <w:t>Phishing</w:t>
-      </w:r>
-      <w:proofErr w:type="spellEnd"/>
+        <w:t>4.1. Ataques de Engenharia Social e Phishing</w:t>
+      </w:r>
     </w:p>
     <w:p>
       <w:pPr>
@@ -1278,27 +1155,7 @@
           <w:u w:val="single"/>
           <w:lang w:val="en-US"/>
         </w:rPr>
-        <w:t xml:space="preserve">4.3. </w:t>
-      </w:r>
-      <w:proofErr w:type="spellStart"/>
-      <w:r>
-        <w:rPr>
-          <w:sz w:val="22"/>
-          <w:szCs w:val="22"/>
-          <w:u w:val="single"/>
-          <w:lang w:val="en-US"/>
-        </w:rPr>
-        <w:t>Ataques</w:t>
-      </w:r>
-      <w:proofErr w:type="spellEnd"/>
-      <w:r>
-        <w:rPr>
-          <w:sz w:val="22"/>
-          <w:szCs w:val="22"/>
-          <w:u w:val="single"/>
-          <w:lang w:val="en-US"/>
-        </w:rPr>
-        <w:t xml:space="preserve"> Man-in-the-Middle (MitM)</w:t>
+        <w:t>4.3. Ataques Man-in-the-Middle (MitM)</w:t>
       </w:r>
     </w:p>
     <w:p>
@@ -1398,46 +1255,26 @@
           <w:szCs w:val="22"/>
           <w:u w:val="single"/>
         </w:rPr>
-        <w:t xml:space="preserve">6.1. FIDO2 e </w:t>
-      </w:r>
-      <w:proofErr w:type="spellStart"/>
-      <w:r>
+        <w:t>6.1. FIDO2 e WebAuthn</w:t>
+      </w:r>
+    </w:p>
+    <w:p>
+      <w:pPr>
+        <w:jc w:val="center"/>
         <w:rPr>
           <w:sz w:val="22"/>
           <w:szCs w:val="22"/>
           <w:u w:val="single"/>
         </w:rPr>
-        <w:t>WebAuthn</w:t>
-      </w:r>
-      <w:proofErr w:type="spellEnd"/>
-    </w:p>
-    <w:p>
-      <w:pPr>
-        <w:jc w:val="center"/>
+      </w:pPr>
+      <w:r>
         <w:rPr>
           <w:sz w:val="22"/>
           <w:szCs w:val="22"/>
           <w:u w:val="single"/>
         </w:rPr>
-      </w:pPr>
-      <w:r>
-        <w:rPr>
-          <w:sz w:val="22"/>
-          <w:szCs w:val="22"/>
-          <w:u w:val="single"/>
-        </w:rPr>
-        <w:t xml:space="preserve">6.2. </w:t>
-      </w:r>
-      <w:proofErr w:type="spellStart"/>
-      <w:r>
-        <w:rPr>
-          <w:sz w:val="22"/>
-          <w:szCs w:val="22"/>
-          <w:u w:val="single"/>
-        </w:rPr>
-        <w:t>Passkeys</w:t>
-      </w:r>
-      <w:proofErr w:type="spellEnd"/>
+        <w:t>6.2. Passkeys</w:t>
+      </w:r>
     </w:p>
     <w:p>
       <w:pPr>
@@ -1561,21 +1398,12 @@
       </w:r>
     </w:p>
     <w:p>
-      <w:proofErr w:type="spellStart"/>
       <w:r>
         <w:rPr>
           <w:i/>
           <w:iCs/>
         </w:rPr>
-        <w:t>One</w:t>
-      </w:r>
-      <w:proofErr w:type="spellEnd"/>
-      <w:r>
-        <w:rPr>
-          <w:i/>
-          <w:iCs/>
-        </w:rPr>
-        <w:t>-Time Password</w:t>
+        <w:t>One-Time Password</w:t>
       </w:r>
       <w:r>
         <w:t xml:space="preserve"> (OTP), ou palavra-passe de uso único, é uma sequência de caracteres numéricos ou alfanuméricos gerada automaticamente para autenticar um utilizador numa única sessão de login ou transação. Ao contrário das passwords estáticas, a OTP </w:t>
@@ -1624,15 +1452,7 @@
         <w:t xml:space="preserve">investigaremos </w:t>
       </w:r>
       <w:r>
-        <w:t xml:space="preserve">o funcionamento técnico dos </w:t>
-      </w:r>
-      <w:proofErr w:type="spellStart"/>
-      <w:r>
-        <w:t>OTPs</w:t>
-      </w:r>
-      <w:proofErr w:type="spellEnd"/>
-      <w:r>
-        <w:t>, explorar os algoritmos matemáticos que os sustentam (RFC 4226 e RFC 6238), comparar os diferentes métodos de entrega e analisar as vulnerabilidades de segurança associadas, oferecendo uma visão clara sobre o estado da arte na Autenticação de Dois Fatores (2FA).</w:t>
+        <w:t>o funcionamento técnico dos OTPs, explorar os algoritmos matemáticos que os sustentam (RFC 4226 e RFC 6238), comparar os diferentes métodos de entrega e analisar as vulnerabilidades de segurança associadas, oferecendo uma visão clara sobre o estado da arte na Autenticação de Dois Fatores (2FA).</w:t>
       </w:r>
     </w:p>
     <w:p>
@@ -1706,7 +1526,6 @@
       <w:r>
         <w:t xml:space="preserve"> reside tanto na tecnologia como no comportamento: existe uma tendência humana natural para a previsibilidade e para a reutilização da mesma senha em múltiplos serviços, o que, somado à suscetibilidade a </w:t>
       </w:r>
-      <w:proofErr w:type="spellStart"/>
       <w:r>
         <w:rPr>
           <w:i/>
@@ -1714,7 +1533,6 @@
         </w:rPr>
         <w:t>keyloggers</w:t>
       </w:r>
-      <w:proofErr w:type="spellEnd"/>
       <w:r>
         <w:t>, cria um</w:t>
       </w:r>
@@ -1796,17 +1614,8 @@
           <w:bCs/>
         </w:rPr>
         <w:lastRenderedPageBreak/>
-        <w:t xml:space="preserve">2.2. Criptografia Simétrica e </w:t>
-      </w:r>
-      <w:proofErr w:type="spellStart"/>
-      <w:r>
-        <w:rPr>
-          <w:b/>
-          <w:bCs/>
-        </w:rPr>
-        <w:t>Hashing</w:t>
-      </w:r>
-      <w:proofErr w:type="spellEnd"/>
+        <w:t>2.2. Criptografia Simétrica e Hashing</w:t>
+      </w:r>
     </w:p>
     <w:p>
       <w:r>
@@ -1825,101 +1634,141 @@
       <w:r>
         <w:t xml:space="preserve"> (</w:t>
       </w:r>
-      <w:proofErr w:type="spellStart"/>
       <w:r>
         <w:rPr>
           <w:i/>
           <w:iCs/>
         </w:rPr>
-        <w:t>shared</w:t>
-      </w:r>
-      <w:proofErr w:type="spellEnd"/>
+        <w:t>shared secret</w:t>
+      </w:r>
+      <w:r>
+        <w:t xml:space="preserve">). Podemos imaginar isto como uma chave-mestra invisível que reside, em simultâneo, em dois lugares: no servidor da empresa e no dispositivo do utilizador (seja uma </w:t>
+      </w:r>
       <w:r>
         <w:rPr>
           <w:i/>
           <w:iCs/>
         </w:rPr>
-        <w:t xml:space="preserve"> </w:t>
-      </w:r>
-      <w:proofErr w:type="spellStart"/>
+        <w:t>app</w:t>
+      </w:r>
+      <w:r>
+        <w:t xml:space="preserve"> ou um </w:t>
+      </w:r>
       <w:r>
         <w:rPr>
           <w:i/>
           <w:iCs/>
         </w:rPr>
-        <w:t>secret</w:t>
-      </w:r>
-      <w:proofErr w:type="spellEnd"/>
-      <w:r>
-        <w:t xml:space="preserve">). Podemos imaginar isto como uma chave-mestra invisível que reside, em simultâneo, em dois lugares: no servidor da empresa e no dispositivo do utilizador (seja uma </w:t>
-      </w:r>
-      <w:r>
-        <w:rPr>
+        <w:t>token</w:t>
+      </w:r>
+      <w:r>
+        <w:t xml:space="preserve"> físico).</w:t>
+      </w:r>
+    </w:p>
+    <w:p>
+      <w:r>
+        <w:t xml:space="preserve">Mas o segredo por si só não basta. Para gerar o código final, entra em ação uma </w:t>
+      </w:r>
+      <w:r>
+        <w:rPr>
+          <w:b/>
+          <w:bCs/>
+        </w:rPr>
+        <w:t xml:space="preserve">função de </w:t>
+      </w:r>
+      <w:r>
+        <w:rPr>
+          <w:b/>
+          <w:bCs/>
           <w:i/>
           <w:iCs/>
         </w:rPr>
-        <w:t>app</w:t>
-      </w:r>
-      <w:r>
-        <w:t xml:space="preserve"> ou um </w:t>
-      </w:r>
-      <w:proofErr w:type="spellStart"/>
-      <w:r>
-        <w:rPr>
+        <w:t>hashing</w:t>
+      </w:r>
+      <w:r>
+        <w:rPr>
+          <w:b/>
+          <w:bCs/>
+        </w:rPr>
+        <w:t xml:space="preserve"> criptográfico</w:t>
+      </w:r>
+      <w:r>
+        <w:t xml:space="preserve"> (utilizando algoritmos robustos como SHA-256 ou SHA-512). Esta função atua como um mecanismo de combinação digital: ela pega naquele segredo estático e mistura-o com um </w:t>
+      </w:r>
+      <w:r>
+        <w:rPr>
+          <w:b/>
+          <w:bCs/>
+        </w:rPr>
+        <w:t>fator móvel</w:t>
+      </w:r>
+      <w:r>
+        <w:t>,</w:t>
+      </w:r>
+      <w:r>
+        <w:t xml:space="preserve"> algo que está sempre a mudar, como um contador sequencial ou a hora exata do relógio. O resultado dessa combinação é o código OTP: único, sincronizado e seguro.</w:t>
+      </w:r>
+    </w:p>
+    <w:p>
+      <w:pPr>
+        <w:rPr>
+          <w:b/>
+          <w:bCs/>
+          <w:lang w:val="en-US"/>
+        </w:rPr>
+      </w:pPr>
+      <w:r>
+        <w:rPr>
+          <w:b/>
+          <w:bCs/>
+          <w:lang w:val="en-US"/>
+        </w:rPr>
+        <w:t>2.3. HOTP (HMAC-based One-Time Password)</w:t>
+      </w:r>
+    </w:p>
+    <w:p>
+      <w:r>
+        <w:t xml:space="preserve">Definido na norma </w:t>
+      </w:r>
+      <w:r>
+        <w:rPr>
+          <w:b/>
+          <w:bCs/>
+        </w:rPr>
+        <w:t>RFC 4226</w:t>
+      </w:r>
+      <w:r>
+        <w:t>, o HOTP opera com base num contador de eventos. A lógica é sequencial: cada vez que o utilizador solicita um código, o contador avança uma unidade (+1), exigindo que o dispositivo e o servidor estejam perfeitamente alinhado</w:t>
+      </w:r>
+      <w:r>
+        <w:t>s</w:t>
+      </w:r>
+      <w:r>
+        <w:t xml:space="preserve">. </w:t>
+      </w:r>
+    </w:p>
+    <w:p>
+      <w:r>
+        <w:t xml:space="preserve">No entanto, para evitar bloqueios quando o utilizador gera códigos no dispositivo sem os utilizar (criando um desfasamento), o sistema utiliza uma margem de tolerância conhecida como </w:t>
+      </w:r>
+      <w:r>
+        <w:rPr>
+          <w:b/>
+          <w:bCs/>
+        </w:rPr>
+        <w:t xml:space="preserve">janela de </w:t>
+      </w:r>
+      <w:r>
+        <w:rPr>
+          <w:b/>
+          <w:bCs/>
           <w:i/>
           <w:iCs/>
         </w:rPr>
-        <w:t>token</w:t>
-      </w:r>
-      <w:proofErr w:type="spellEnd"/>
-      <w:r>
-        <w:t xml:space="preserve"> físico).</w:t>
-      </w:r>
-    </w:p>
-    <w:p>
-      <w:r>
-        <w:t xml:space="preserve">Mas o segredo por si só não basta. Para gerar o código final, entra em ação uma </w:t>
-      </w:r>
-      <w:r>
-        <w:rPr>
-          <w:b/>
-          <w:bCs/>
-        </w:rPr>
-        <w:t xml:space="preserve">função de </w:t>
-      </w:r>
-      <w:proofErr w:type="spellStart"/>
-      <w:r>
-        <w:rPr>
-          <w:b/>
-          <w:bCs/>
-          <w:i/>
-          <w:iCs/>
-        </w:rPr>
-        <w:t>hashing</w:t>
-      </w:r>
-      <w:proofErr w:type="spellEnd"/>
-      <w:r>
-        <w:rPr>
-          <w:b/>
-          <w:bCs/>
-        </w:rPr>
-        <w:t xml:space="preserve"> criptográfico</w:t>
-      </w:r>
-      <w:r>
-        <w:t xml:space="preserve"> (utilizando algoritmos robustos como SHA-256 ou SHA-512). Esta função atua como um mecanismo de combinação digital: ela pega naquele segredo estático e mistura-o com um </w:t>
-      </w:r>
-      <w:r>
-        <w:rPr>
-          <w:b/>
-          <w:bCs/>
-        </w:rPr>
-        <w:t>fator móvel</w:t>
-      </w:r>
-      <w:r>
-        <w:t>,</w:t>
-      </w:r>
-      <w:r>
-        <w:t xml:space="preserve"> algo que está sempre a mudar, como um contador sequencial ou a hora exata do relógio. O resultado dessa combinação é o código OTP: único, sincronizado e seguro.</w:t>
+        <w:t>look-ahead</w:t>
+      </w:r>
+      <w:r>
+        <w:t>. Isto permite ao servidor reconhecer códigos ligeiramente à frente da contagem atual e ressincronizar-se automaticamente.</w:t>
       </w:r>
     </w:p>
     <w:p>
@@ -1936,93 +1785,12 @@
           <w:bCs/>
           <w:lang w:val="en-US"/>
         </w:rPr>
-        <w:t>2.3. HOTP (HMAC-based One-Time Password)</w:t>
-      </w:r>
-    </w:p>
-    <w:p>
-      <w:r>
-        <w:t xml:space="preserve">Definido na norma </w:t>
-      </w:r>
-      <w:r>
-        <w:rPr>
-          <w:b/>
-          <w:bCs/>
-        </w:rPr>
-        <w:t>RFC 4226</w:t>
-      </w:r>
-      <w:r>
-        <w:t>, o HOTP opera com base num contador de eventos. A lógica é sequencial: cada vez que o utilizador solicita um código, o contador avança uma unidade (+1), exigindo que o dispositivo e o servidor estejam perfeitamente alinhado</w:t>
-      </w:r>
-      <w:r>
-        <w:t>s</w:t>
-      </w:r>
-      <w:r>
-        <w:t xml:space="preserve">. </w:t>
-      </w:r>
-    </w:p>
-    <w:p>
-      <w:r>
-        <w:t xml:space="preserve">No entanto, para evitar bloqueios quando o utilizador gera códigos no dispositivo sem os utilizar (criando um desfasamento), o sistema utiliza uma margem de tolerância conhecida como </w:t>
-      </w:r>
-      <w:r>
-        <w:rPr>
-          <w:b/>
-          <w:bCs/>
-        </w:rPr>
-        <w:t xml:space="preserve">janela de </w:t>
-      </w:r>
-      <w:r>
-        <w:rPr>
-          <w:b/>
-          <w:bCs/>
-          <w:i/>
-          <w:iCs/>
-        </w:rPr>
-        <w:t>look-</w:t>
-      </w:r>
-      <w:proofErr w:type="spellStart"/>
-      <w:r>
-        <w:rPr>
-          <w:b/>
-          <w:bCs/>
-          <w:i/>
-          <w:iCs/>
-        </w:rPr>
-        <w:t>ahead</w:t>
-      </w:r>
-      <w:proofErr w:type="spellEnd"/>
-      <w:r>
-        <w:t>. Isto permite ao servidor reconhecer códigos ligeiramente à frente da contagem atual e ressincronizar-se automaticamente.</w:t>
-      </w:r>
-    </w:p>
-    <w:p>
-      <w:pPr>
-        <w:rPr>
-          <w:b/>
-          <w:bCs/>
-          <w:lang w:val="en-US"/>
-        </w:rPr>
-      </w:pPr>
-      <w:r>
-        <w:rPr>
-          <w:b/>
-          <w:bCs/>
-          <w:lang w:val="en-US"/>
-        </w:rPr>
         <w:t>2.4. TOTP (Time-based One-Time Password)</w:t>
       </w:r>
     </w:p>
     <w:p>
       <w:r>
-        <w:t xml:space="preserve">Consolidado como o padrão atual da indústria (sendo a base de aplicações como o Google ou Microsoft </w:t>
-      </w:r>
-      <w:proofErr w:type="spellStart"/>
-      <w:r>
-        <w:t>Authenticator</w:t>
-      </w:r>
-      <w:proofErr w:type="spellEnd"/>
-      <w:r>
-        <w:t xml:space="preserve">), o TOTP, definido na RFC 6238, representa a evolução natural do método anterior. A sua grande inovação reside </w:t>
+        <w:t xml:space="preserve">Consolidado como o padrão atual da indústria (sendo a base de aplicações como o Google ou Microsoft Authenticator), o TOTP, definido na RFC 6238, representa a evolução natural do método anterior. A sua grande inovação reside </w:t>
       </w:r>
       <w:r>
         <w:rPr>
@@ -2156,23 +1924,7 @@
           <w:b/>
           <w:bCs/>
         </w:rPr>
-        <w:t xml:space="preserve">3.1. </w:t>
-      </w:r>
-      <w:proofErr w:type="spellStart"/>
-      <w:r>
-        <w:rPr>
-          <w:b/>
-          <w:bCs/>
-        </w:rPr>
-        <w:t>Tokens</w:t>
-      </w:r>
-      <w:proofErr w:type="spellEnd"/>
-      <w:r>
-        <w:rPr>
-          <w:b/>
-          <w:bCs/>
-        </w:rPr>
-        <w:t xml:space="preserve"> de Hardware</w:t>
+        <w:t>3.1. Tokens de Hardware</w:t>
       </w:r>
     </w:p>
     <w:p>
@@ -2204,23 +1956,7 @@
         <w:t>Vantagens:</w:t>
       </w:r>
       <w:r>
-        <w:t xml:space="preserve"> Isolados da internet (</w:t>
-      </w:r>
-      <w:proofErr w:type="spellStart"/>
-      <w:r>
-        <w:t>air-gapped</w:t>
-      </w:r>
-      <w:proofErr w:type="spellEnd"/>
-      <w:r>
-        <w:t xml:space="preserve">), imunes a </w:t>
-      </w:r>
-      <w:proofErr w:type="spellStart"/>
-      <w:r>
-        <w:t>malware</w:t>
-      </w:r>
-      <w:proofErr w:type="spellEnd"/>
-      <w:r>
-        <w:t xml:space="preserve"> no PC/Smartphone.</w:t>
+        <w:t xml:space="preserve"> Isolados da internet (air-gapped), imunes a malware no PC/Smartphone.</w:t>
       </w:r>
     </w:p>
     <w:p>
@@ -2253,39 +1989,7 @@
           <w:b/>
           <w:bCs/>
         </w:rPr>
-        <w:t xml:space="preserve">3.2. SMS (Short </w:t>
-      </w:r>
-      <w:proofErr w:type="spellStart"/>
-      <w:r>
-        <w:rPr>
-          <w:b/>
-          <w:bCs/>
-        </w:rPr>
-        <w:t>Message</w:t>
-      </w:r>
-      <w:proofErr w:type="spellEnd"/>
-      <w:r>
-        <w:rPr>
-          <w:b/>
-          <w:bCs/>
-        </w:rPr>
-        <w:t xml:space="preserve"> </w:t>
-      </w:r>
-      <w:proofErr w:type="spellStart"/>
-      <w:r>
-        <w:rPr>
-          <w:b/>
-          <w:bCs/>
-        </w:rPr>
-        <w:t>Service</w:t>
-      </w:r>
-      <w:proofErr w:type="spellEnd"/>
-      <w:r>
-        <w:rPr>
-          <w:b/>
-          <w:bCs/>
-        </w:rPr>
-        <w:t>)</w:t>
+        <w:t>3.2. SMS (Short Message Service)</w:t>
       </w:r>
     </w:p>
     <w:p>
@@ -2341,23 +2045,7 @@
           <w:b/>
           <w:bCs/>
         </w:rPr>
-        <w:t xml:space="preserve">3.3. Aplicações Autenticadoras (Soft </w:t>
-      </w:r>
-      <w:proofErr w:type="spellStart"/>
-      <w:r>
-        <w:rPr>
-          <w:b/>
-          <w:bCs/>
-        </w:rPr>
-        <w:t>Tokens</w:t>
-      </w:r>
-      <w:proofErr w:type="spellEnd"/>
-      <w:r>
-        <w:rPr>
-          <w:b/>
-          <w:bCs/>
-        </w:rPr>
-        <w:t>)</w:t>
+        <w:t>3.3. Aplicações Autenticadoras (Soft Tokens)</w:t>
       </w:r>
     </w:p>
     <w:p>
@@ -2380,15 +2068,7 @@
         <w:t>Vantagens:</w:t>
       </w:r>
       <w:r>
-        <w:t xml:space="preserve"> Custo zero, funciona offline, mais seguro </w:t>
-      </w:r>
-      <w:proofErr w:type="gramStart"/>
-      <w:r>
-        <w:t>que</w:t>
-      </w:r>
-      <w:proofErr w:type="gramEnd"/>
-      <w:r>
-        <w:t xml:space="preserve"> SMS.</w:t>
+        <w:t xml:space="preserve"> Custo zero, funciona offline, mais seguro que SMS.</w:t>
       </w:r>
     </w:p>
     <w:p>
@@ -2406,40 +2086,23 @@
         <w:t>Desvantagens:</w:t>
       </w:r>
       <w:r>
-        <w:t xml:space="preserve"> Se o utilizador perder o telemóvel sem backup das chaves ("</w:t>
-      </w:r>
-      <w:proofErr w:type="spellStart"/>
-      <w:r>
-        <w:t>seeds</w:t>
-      </w:r>
-      <w:proofErr w:type="spellEnd"/>
-      <w:r>
-        <w:t>"), perde o acesso às contas.</w:t>
-      </w:r>
-    </w:p>
-    <w:p>
-      <w:pPr>
-        <w:rPr>
-          <w:b/>
-          <w:bCs/>
-        </w:rPr>
-      </w:pPr>
-      <w:r>
-        <w:rPr>
-          <w:b/>
-          <w:bCs/>
-        </w:rPr>
-        <w:t xml:space="preserve">3.4. E-mail e Push </w:t>
-      </w:r>
-      <w:proofErr w:type="spellStart"/>
-      <w:r>
-        <w:rPr>
-          <w:b/>
-          <w:bCs/>
-        </w:rPr>
-        <w:t>Notifications</w:t>
-      </w:r>
-      <w:proofErr w:type="spellEnd"/>
+        <w:t xml:space="preserve"> Se o utilizador perder o telemóvel sem backup das chaves ("seeds"), perde o acesso às contas.</w:t>
+      </w:r>
+    </w:p>
+    <w:p>
+      <w:pPr>
+        <w:rPr>
+          <w:b/>
+          <w:bCs/>
+        </w:rPr>
+      </w:pPr>
+      <w:r>
+        <w:rPr>
+          <w:b/>
+          <w:bCs/>
+        </w:rPr>
+        <w:t>3.4. E-mail e Push Notifications</w:t>
+      </w:r>
     </w:p>
     <w:p>
       <w:r>
@@ -2560,23 +2223,13 @@
           <w:b/>
           <w:bCs/>
         </w:rPr>
-        <w:t xml:space="preserve">4.1. Ataques de Engenharia Social e </w:t>
-      </w:r>
-      <w:proofErr w:type="spellStart"/>
-      <w:r>
-        <w:rPr>
-          <w:b/>
-          <w:bCs/>
-        </w:rPr>
-        <w:t>Phishing</w:t>
-      </w:r>
-      <w:proofErr w:type="spellEnd"/>
+        <w:t>4.1. Ataques de Engenharia Social e Phishing</w:t>
+      </w:r>
     </w:p>
     <w:p>
       <w:r>
         <w:t xml:space="preserve">A ameaça mais comum é o </w:t>
       </w:r>
-      <w:proofErr w:type="spellStart"/>
       <w:r>
         <w:rPr>
           <w:i/>
@@ -2584,7 +2237,6 @@
         </w:rPr>
         <w:t>Phishing</w:t>
       </w:r>
-      <w:proofErr w:type="spellEnd"/>
       <w:r>
         <w:t xml:space="preserve"> em tempo real. Ferramentas como o </w:t>
       </w:r>
@@ -2611,17 +2263,8 @@
           <w:b/>
           <w:bCs/>
         </w:rPr>
-        <w:t xml:space="preserve">4.2. SIM </w:t>
-      </w:r>
-      <w:proofErr w:type="spellStart"/>
-      <w:r>
-        <w:rPr>
-          <w:b/>
-          <w:bCs/>
-        </w:rPr>
-        <w:t>Swapping</w:t>
-      </w:r>
-      <w:proofErr w:type="spellEnd"/>
+        <w:t>4.2. SIM Swapping</w:t>
+      </w:r>
     </w:p>
     <w:p>
       <w:r>
@@ -2658,15 +2301,7 @@
         </w:numPr>
       </w:pPr>
       <w:r>
-        <w:t xml:space="preserve">Uma vez ativo, o atacante recebe todos os SMS (incluindo </w:t>
-      </w:r>
-      <w:proofErr w:type="spellStart"/>
-      <w:r>
-        <w:t>OTPs</w:t>
-      </w:r>
-      <w:proofErr w:type="spellEnd"/>
-      <w:r>
-        <w:t xml:space="preserve"> bancários) destinados à vítima.</w:t>
+        <w:t>Uma vez ativo, o atacante recebe todos os SMS (incluindo OTPs bancários) destinados à vítima.</w:t>
       </w:r>
     </w:p>
     <w:p>
@@ -2683,38 +2318,12 @@
           <w:bCs/>
           <w:lang w:val="en-US"/>
         </w:rPr>
-        <w:t xml:space="preserve">4.3. </w:t>
-      </w:r>
-      <w:proofErr w:type="spellStart"/>
-      <w:r>
-        <w:rPr>
-          <w:b/>
-          <w:bCs/>
-          <w:lang w:val="en-US"/>
-        </w:rPr>
-        <w:t>Ataques</w:t>
-      </w:r>
-      <w:proofErr w:type="spellEnd"/>
-      <w:r>
-        <w:rPr>
-          <w:b/>
-          <w:bCs/>
-          <w:lang w:val="en-US"/>
-        </w:rPr>
-        <w:t xml:space="preserve"> Man-in-the-Middle (MitM)</w:t>
-      </w:r>
-    </w:p>
-    <w:p>
-      <w:r>
-        <w:t>Se a comunicação entre o utilizador e o servidor não estiver devidamente encriptada (HTTPS/TLS), ou se houver interceção na rede (</w:t>
-      </w:r>
-      <w:proofErr w:type="spellStart"/>
-      <w:r>
-        <w:t>ex</w:t>
-      </w:r>
-      <w:proofErr w:type="spellEnd"/>
-      <w:r>
-        <w:t>: Wi-Fi público malicioso), os códigos OTP podem ser capturados. Contudo, devido à natureza de "uso único", o atacante tem uma janela de tempo muito curta para atuar.</w:t>
+        <w:t>4.3. Ataques Man-in-the-Middle (MitM)</w:t>
+      </w:r>
+    </w:p>
+    <w:p>
+      <w:r>
+        <w:t>Se a comunicação entre o utilizador e o servidor não estiver devidamente encriptada (HTTPS/TLS), ou se houver interceção na rede (ex: Wi-Fi público malicioso), os códigos OTP podem ser capturados. Contudo, devido à natureza de "uso único", o atacante tem uma janela de tempo muito curta para atuar.</w:t>
       </w:r>
     </w:p>
     <w:p>
@@ -2763,31 +2372,7 @@
     </w:p>
     <w:p>
       <w:r>
-        <w:t xml:space="preserve">Nas suas diretrizes SP 800-63B, o NIST classifica o SMS como um método de autenticação "Restrito". O NIST recomenda explicitamente o abandono do SMS em favor de </w:t>
-      </w:r>
-      <w:proofErr w:type="spellStart"/>
-      <w:r>
-        <w:t>tokens</w:t>
-      </w:r>
-      <w:proofErr w:type="spellEnd"/>
-      <w:r>
-        <w:t xml:space="preserve"> de hardware ou aplicações criptográficas, citando a facilidade de interceção das redes SS7 (</w:t>
-      </w:r>
-      <w:proofErr w:type="spellStart"/>
-      <w:r>
-        <w:t>Signalling</w:t>
-      </w:r>
-      <w:proofErr w:type="spellEnd"/>
-      <w:r>
-        <w:t xml:space="preserve"> </w:t>
-      </w:r>
-      <w:proofErr w:type="spellStart"/>
-      <w:r>
-        <w:t>System</w:t>
-      </w:r>
-      <w:proofErr w:type="spellEnd"/>
-      <w:r>
-        <w:t xml:space="preserve"> No. 7).</w:t>
+        <w:t>Nas suas diretrizes SP 800-63B, o NIST classifica o SMS como um método de autenticação "Restrito". O NIST recomenda explicitamente o abandono do SMS em favor de tokens de hardware ou aplicações criptográficas, citando a facilidade de interceção das redes SS7 (Signalling System No. 7).</w:t>
       </w:r>
     </w:p>
     <w:p>
@@ -2834,189 +2419,116 @@
       <w:r>
         <w:t xml:space="preserve">Na União Europeia, a Diretiva de Serviços de Pagamento 2 (PSD2) tornou obrigatória a </w:t>
       </w:r>
-      <w:proofErr w:type="spellStart"/>
       <w:r>
         <w:rPr>
           <w:i/>
           <w:iCs/>
         </w:rPr>
-        <w:t>Strong</w:t>
-      </w:r>
-      <w:proofErr w:type="spellEnd"/>
+        <w:t>Strong Customer Authentication</w:t>
+      </w:r>
+      <w:r>
+        <w:t xml:space="preserve"> (SCA) para pagamentos eletrónicos. A SCA exige dois de três elementos: Conhecimento, Posse e Inerência. </w:t>
+      </w:r>
+    </w:p>
+    <w:p>
+      <w:r>
+        <w:t>O OTP via SMS satisfaz o requisito de "Posse" (posse do telemóvel), mas a legislação tem empurrado os bancos para soluções baseadas em aplicações proprietárias e bio</w:t>
+      </w:r>
+      <w:r>
+        <w:t>m</w:t>
+      </w:r>
+      <w:r>
+        <w:t>etri</w:t>
+      </w:r>
+      <w:r>
+        <w:t>a.</w:t>
+      </w:r>
+    </w:p>
+    <w:p>
+      <w:r>
+        <w:pict w14:anchorId="3E2FEE01">
+          <v:rect id="_x0000_i1034" style="width:0;height:1.5pt" o:hralign="center" o:hrstd="t" o:hr="t" fillcolor="#a0a0a0" stroked="f"/>
+        </w:pict>
+      </w:r>
+    </w:p>
+    <w:p>
+      <w:pPr>
+        <w:rPr>
+          <w:b/>
+          <w:bCs/>
+        </w:rPr>
+      </w:pPr>
+      <w:r>
+        <w:rPr>
+          <w:b/>
+          <w:bCs/>
+        </w:rPr>
+        <w:t>6. O Futuro da Autenticação: Além do OTP</w:t>
+      </w:r>
+    </w:p>
+    <w:p>
+      <w:r>
+        <w:t xml:space="preserve">O mercado caminha para um futuro </w:t>
+      </w:r>
       <w:r>
         <w:rPr>
           <w:i/>
           <w:iCs/>
         </w:rPr>
-        <w:t xml:space="preserve"> </w:t>
-      </w:r>
-      <w:proofErr w:type="spellStart"/>
+        <w:t>passwordless</w:t>
+      </w:r>
+      <w:r>
+        <w:t xml:space="preserve"> (sem palavras-passe), onde o OTP deixa de ser o protagonista para dar lugar à criptografia assimétrica pura.</w:t>
+      </w:r>
+    </w:p>
+    <w:p>
+      <w:pPr>
+        <w:rPr>
+          <w:b/>
+          <w:bCs/>
+        </w:rPr>
+      </w:pPr>
+      <w:r>
+        <w:rPr>
+          <w:b/>
+          <w:bCs/>
+        </w:rPr>
+        <w:t>6.1. FIDO2 e WebAuthn</w:t>
+      </w:r>
+    </w:p>
+    <w:p>
+      <w:r>
+        <w:t>O padrão FIDO2 permite que utilizadores usem dispositivos comuns para se autenticarem facilmente em serviços online, tanto em ambientes móveis como desktop. Diferente do OTP (onde há um segredo partilhado, suscetível a roubo do lado do servidor), o FIDO utiliza pares de chaves pública/privada. A chave privada nunca sai do dispositivo do utilizador.</w:t>
+      </w:r>
+    </w:p>
+    <w:p>
+      <w:pPr>
+        <w:rPr>
+          <w:b/>
+          <w:bCs/>
+        </w:rPr>
+      </w:pPr>
+      <w:r>
+        <w:rPr>
+          <w:b/>
+          <w:bCs/>
+        </w:rPr>
+        <w:t>6.2. Passkeys</w:t>
+      </w:r>
+    </w:p>
+    <w:p>
+      <w:r>
+        <w:t xml:space="preserve">Introduzidas pelas grandes tecnológicas (Apple, Google, Microsoft), as </w:t>
+      </w:r>
       <w:r>
         <w:rPr>
           <w:i/>
           <w:iCs/>
         </w:rPr>
-        <w:t>Customer</w:t>
-      </w:r>
-      <w:proofErr w:type="spellEnd"/>
-      <w:r>
-        <w:rPr>
-          <w:i/>
-          <w:iCs/>
-        </w:rPr>
-        <w:t xml:space="preserve"> </w:t>
-      </w:r>
-      <w:proofErr w:type="spellStart"/>
-      <w:r>
-        <w:rPr>
-          <w:i/>
-          <w:iCs/>
-        </w:rPr>
-        <w:t>Authentication</w:t>
-      </w:r>
-      <w:proofErr w:type="spellEnd"/>
-      <w:r>
-        <w:t xml:space="preserve"> (SCA) para pagamentos eletrónicos. A SCA exige dois de três elementos: Conhecimento, Posse e Inerência. </w:t>
-      </w:r>
-    </w:p>
-    <w:p>
-      <w:r>
-        <w:t>O OTP via SMS satisfaz o requisito de "Posse" (posse do telemóvel), mas a legislação tem empurrado os bancos para soluções baseadas em aplicações proprietárias e bio</w:t>
-      </w:r>
-      <w:r>
-        <w:t>m</w:t>
-      </w:r>
-      <w:r>
-        <w:t>etri</w:t>
-      </w:r>
-      <w:r>
-        <w:t>a.</w:t>
-      </w:r>
-    </w:p>
-    <w:p>
-      <w:pPr>
-        <w:rPr>
-          <w:b/>
-          <w:bCs/>
-        </w:rPr>
-      </w:pPr>
-      <w:r>
-        <w:rPr>
-          <w:b/>
-          <w:bCs/>
-        </w:rPr>
-        <w:t>6. O Futuro da Autenticação: Além do OTP</w:t>
-      </w:r>
-    </w:p>
-    <w:p>
-      <w:r>
-        <w:t xml:space="preserve">O mercado caminha para um futuro </w:t>
-      </w:r>
-      <w:proofErr w:type="spellStart"/>
-      <w:r>
-        <w:rPr>
-          <w:i/>
-          <w:iCs/>
-        </w:rPr>
-        <w:t>passwordless</w:t>
-      </w:r>
-      <w:proofErr w:type="spellEnd"/>
-      <w:r>
-        <w:t xml:space="preserve"> (sem palavras-passe), onde o OTP deixa de ser o protagonista para dar lugar à criptografia assimétrica pura.</w:t>
-      </w:r>
-    </w:p>
-    <w:p>
-      <w:pPr>
-        <w:rPr>
-          <w:b/>
-          <w:bCs/>
-        </w:rPr>
-      </w:pPr>
-      <w:r>
-        <w:rPr>
-          <w:b/>
-          <w:bCs/>
-        </w:rPr>
-        <w:t xml:space="preserve">6.1. FIDO2 e </w:t>
-      </w:r>
-      <w:proofErr w:type="spellStart"/>
-      <w:r>
-        <w:rPr>
-          <w:b/>
-          <w:bCs/>
-        </w:rPr>
-        <w:t>WebAuthn</w:t>
-      </w:r>
-      <w:proofErr w:type="spellEnd"/>
-    </w:p>
-    <w:p>
-      <w:r>
-        <w:t>O padrão FIDO2 permite que utilizadores usem dispositivos comuns para se autenticarem facilmente em serviços online, tanto em ambientes móveis como desktop. Diferente do OTP (onde há um segredo partilhado, suscetível a roubo do lado do servidor), o FIDO utiliza pares de chaves pública/privada. A chave privada nunca sai do dispositivo do utilizador.</w:t>
-      </w:r>
-    </w:p>
-    <w:p>
-      <w:pPr>
-        <w:rPr>
-          <w:b/>
-          <w:bCs/>
-        </w:rPr>
-      </w:pPr>
-      <w:r>
-        <w:rPr>
-          <w:b/>
-          <w:bCs/>
-        </w:rPr>
-        <w:t xml:space="preserve">6.2. </w:t>
-      </w:r>
-      <w:proofErr w:type="spellStart"/>
-      <w:r>
-        <w:rPr>
-          <w:b/>
-          <w:bCs/>
-        </w:rPr>
         <w:t>Passkeys</w:t>
       </w:r>
-      <w:proofErr w:type="spellEnd"/>
-    </w:p>
-    <w:p>
-      <w:r>
-        <w:t xml:space="preserve">Introduzidas pelas grandes tecnológicas (Apple, Google, Microsoft), as </w:t>
-      </w:r>
-      <w:proofErr w:type="spellStart"/>
-      <w:r>
-        <w:rPr>
-          <w:i/>
-          <w:iCs/>
-        </w:rPr>
-        <w:t>Passkeys</w:t>
-      </w:r>
-      <w:proofErr w:type="spellEnd"/>
-      <w:r>
-        <w:t xml:space="preserve"> são a implementação comercial do FIDO2. Elas substituem tanto a password como o OTP. O "código" nunca é visto pelo utilizador; a autenticação é um "</w:t>
-      </w:r>
-      <w:proofErr w:type="spellStart"/>
-      <w:r>
-        <w:t>handshake</w:t>
-      </w:r>
-      <w:proofErr w:type="spellEnd"/>
-      <w:r>
-        <w:t>" criptográfico validado por biometria (</w:t>
-      </w:r>
-      <w:proofErr w:type="spellStart"/>
-      <w:r>
-        <w:t>FaceID</w:t>
-      </w:r>
-      <w:proofErr w:type="spellEnd"/>
-      <w:r>
-        <w:t xml:space="preserve">, </w:t>
-      </w:r>
-      <w:proofErr w:type="spellStart"/>
-      <w:r>
-        <w:t>TouchID</w:t>
-      </w:r>
-      <w:proofErr w:type="spellEnd"/>
-      <w:r>
-        <w:t>).</w:t>
+      <w:r>
+        <w:t xml:space="preserve"> são a implementação comercial do FIDO2. Elas substituem tanto a password como o OTP. O "código" nunca é visto pelo utilizador; a autenticação é um "handshake" criptográfico validado por biometria (FaceID, TouchID).</w:t>
       </w:r>
     </w:p>
     <w:p>
@@ -3043,86 +2555,37 @@
     </w:p>
     <w:p>
       <w:r>
-        <w:t xml:space="preserve">A implementação de </w:t>
-      </w:r>
-      <w:proofErr w:type="spellStart"/>
-      <w:r>
-        <w:t>One</w:t>
-      </w:r>
-      <w:proofErr w:type="spellEnd"/>
-      <w:r>
-        <w:t xml:space="preserve">-Time Passwords representou um salto qualitativo na segurança cibernética nas últimas duas décadas, mitigando eficazmente ataques baseados na reutilização de credenciais. No entanto, a evolução das táticas </w:t>
-      </w:r>
-      <w:proofErr w:type="spellStart"/>
-      <w:r>
-        <w:t>cibercriminosas</w:t>
-      </w:r>
-      <w:proofErr w:type="spellEnd"/>
-      <w:r>
-        <w:t xml:space="preserve">, especialmente através de </w:t>
+        <w:t xml:space="preserve">A implementação de One-Time Passwords representou um salto qualitativo na segurança cibernética nas últimas duas décadas, mitigando eficazmente ataques baseados na reutilização de credenciais. No entanto, a evolução das táticas cibercriminosas, especialmente através de </w:t>
       </w:r>
       <w:r>
         <w:rPr>
           <w:i/>
           <w:iCs/>
         </w:rPr>
-        <w:t xml:space="preserve">SIM </w:t>
-      </w:r>
-      <w:proofErr w:type="spellStart"/>
+        <w:t>SIM Swapping</w:t>
+      </w:r>
+      <w:r>
+        <w:t xml:space="preserve"> e </w:t>
+      </w:r>
       <w:r>
         <w:rPr>
           <w:i/>
           <w:iCs/>
         </w:rPr>
-        <w:t>Swapping</w:t>
-      </w:r>
-      <w:proofErr w:type="spellEnd"/>
-      <w:r>
-        <w:t xml:space="preserve"> e </w:t>
-      </w:r>
-      <w:r>
-        <w:rPr>
-          <w:i/>
-          <w:iCs/>
-        </w:rPr>
-        <w:t xml:space="preserve">Real-time </w:t>
-      </w:r>
-      <w:proofErr w:type="spellStart"/>
-      <w:r>
-        <w:rPr>
-          <w:i/>
-          <w:iCs/>
-        </w:rPr>
-        <w:t>Phishing</w:t>
-      </w:r>
-      <w:proofErr w:type="spellEnd"/>
+        <w:t>Real-time Phishing</w:t>
+      </w:r>
       <w:r>
         <w:t>, expôs as fragilidades dos métodos de entrega tradicionais como o SMS.</w:t>
       </w:r>
     </w:p>
     <w:p>
       <w:r>
-        <w:t xml:space="preserve">Para organizações modernas, a utilização de </w:t>
-      </w:r>
-      <w:proofErr w:type="spellStart"/>
-      <w:r>
-        <w:t>OTPs</w:t>
-      </w:r>
-      <w:proofErr w:type="spellEnd"/>
-      <w:r>
-        <w:t xml:space="preserve"> continua a ser uma medida de segurança essencial, mas deve ser encarada como uma camada de transição. A implementação ideal hoje recai sobre algoritmos TOTP via aplicações ou chaves de segurança físicas, enquanto se prepara a infraestrutura para a adoção massiva de tecnologias FIDO2/</w:t>
-      </w:r>
-      <w:proofErr w:type="spellStart"/>
-      <w:r>
-        <w:t>Passkeys</w:t>
-      </w:r>
-      <w:proofErr w:type="spellEnd"/>
-      <w:r>
-        <w:t>, que prometem eliminar o erro humano da equação da autenticação.</w:t>
-      </w:r>
-    </w:p>
-    <w:p>
-      <w:r>
+        <w:t>Para organizações modernas, a utilização de OTPs continua a ser uma medida de segurança essencial, mas deve ser encarada como uma camada de transição. A implementação ideal hoje recai sobre algoritmos TOTP via aplicações ou chaves de segurança físicas, enquanto se prepara a infraestrutura para a adoção massiva de tecnologias FIDO2/Passkeys, que prometem eliminar o erro humano da equação da autenticação.</w:t>
+      </w:r>
+    </w:p>
+    <w:p>
+      <w:r>
+        <w:lastRenderedPageBreak/>
         <w:pict w14:anchorId="1A6FF865">
           <v:rect id="_x0000_i1032" style="width:0;height:1.5pt" o:hralign="center" o:hrstd="t" o:hr="t" fillcolor="#a0a0a0" stroked="f"/>
         </w:pict>
@@ -3140,7 +2603,6 @@
           <w:b/>
           <w:bCs/>
         </w:rPr>
-        <w:lastRenderedPageBreak/>
         <w:t>8. Bibliografia</w:t>
       </w:r>
     </w:p>
@@ -3187,93 +2649,8 @@
           <w:lang w:eastAsia="pt-PT"/>
           <w14:ligatures w14:val="none"/>
         </w:rPr>
-        <w:t xml:space="preserve">HOTP: </w:t>
-      </w:r>
-      <w:proofErr w:type="spellStart"/>
-      <w:r>
-        <w:rPr>
-          <w:rFonts w:eastAsia="Times New Roman" w:cs="Times New Roman"/>
-          <w:i/>
-          <w:iCs/>
-          <w:kern w:val="0"/>
-          <w:lang w:eastAsia="pt-PT"/>
-          <w14:ligatures w14:val="none"/>
-        </w:rPr>
-        <w:t>An</w:t>
-      </w:r>
-      <w:proofErr w:type="spellEnd"/>
-      <w:r>
-        <w:rPr>
-          <w:rFonts w:eastAsia="Times New Roman" w:cs="Times New Roman"/>
-          <w:i/>
-          <w:iCs/>
-          <w:kern w:val="0"/>
-          <w:lang w:eastAsia="pt-PT"/>
-          <w14:ligatures w14:val="none"/>
-        </w:rPr>
-        <w:t xml:space="preserve"> HMAC-</w:t>
-      </w:r>
-      <w:proofErr w:type="spellStart"/>
-      <w:r>
-        <w:rPr>
-          <w:rFonts w:eastAsia="Times New Roman" w:cs="Times New Roman"/>
-          <w:i/>
-          <w:iCs/>
-          <w:kern w:val="0"/>
-          <w:lang w:eastAsia="pt-PT"/>
-          <w14:ligatures w14:val="none"/>
-        </w:rPr>
-        <w:t>Based</w:t>
-      </w:r>
-      <w:proofErr w:type="spellEnd"/>
-      <w:r>
-        <w:rPr>
-          <w:rFonts w:eastAsia="Times New Roman" w:cs="Times New Roman"/>
-          <w:i/>
-          <w:iCs/>
-          <w:kern w:val="0"/>
-          <w:lang w:eastAsia="pt-PT"/>
-          <w14:ligatures w14:val="none"/>
-        </w:rPr>
-        <w:t xml:space="preserve"> </w:t>
-      </w:r>
-      <w:proofErr w:type="spellStart"/>
-      <w:r>
-        <w:rPr>
-          <w:rFonts w:eastAsia="Times New Roman" w:cs="Times New Roman"/>
-          <w:i/>
-          <w:iCs/>
-          <w:kern w:val="0"/>
-          <w:lang w:eastAsia="pt-PT"/>
-          <w14:ligatures w14:val="none"/>
-        </w:rPr>
-        <w:t>One</w:t>
-      </w:r>
-      <w:proofErr w:type="spellEnd"/>
-      <w:r>
-        <w:rPr>
-          <w:rFonts w:eastAsia="Times New Roman" w:cs="Times New Roman"/>
-          <w:i/>
-          <w:iCs/>
-          <w:kern w:val="0"/>
-          <w:lang w:eastAsia="pt-PT"/>
-          <w14:ligatures w14:val="none"/>
-        </w:rPr>
-        <w:t xml:space="preserve">-Time Password </w:t>
-      </w:r>
-      <w:proofErr w:type="spellStart"/>
-      <w:r>
-        <w:rPr>
-          <w:rFonts w:eastAsia="Times New Roman" w:cs="Times New Roman"/>
-          <w:i/>
-          <w:iCs/>
-          <w:kern w:val="0"/>
-          <w:lang w:eastAsia="pt-PT"/>
-          <w14:ligatures w14:val="none"/>
-        </w:rPr>
-        <w:t>Algorithm</w:t>
-      </w:r>
-      <w:proofErr w:type="spellEnd"/>
+        <w:t>HOTP: An HMAC-Based One-Time Password Algorithm</w:t>
+      </w:r>
       <w:r>
         <w:rPr>
           <w:rFonts w:eastAsia="Times New Roman" w:cs="Times New Roman"/>
@@ -3281,47 +2658,7 @@
           <w:lang w:eastAsia="pt-PT"/>
           <w14:ligatures w14:val="none"/>
         </w:rPr>
-        <w:t xml:space="preserve">. Internet </w:t>
-      </w:r>
-      <w:proofErr w:type="spellStart"/>
-      <w:r>
-        <w:rPr>
-          <w:rFonts w:eastAsia="Times New Roman" w:cs="Times New Roman"/>
-          <w:kern w:val="0"/>
-          <w:lang w:eastAsia="pt-PT"/>
-          <w14:ligatures w14:val="none"/>
-        </w:rPr>
-        <w:t>Engineering</w:t>
-      </w:r>
-      <w:proofErr w:type="spellEnd"/>
-      <w:r>
-        <w:rPr>
-          <w:rFonts w:eastAsia="Times New Roman" w:cs="Times New Roman"/>
-          <w:kern w:val="0"/>
-          <w:lang w:eastAsia="pt-PT"/>
-          <w14:ligatures w14:val="none"/>
-        </w:rPr>
-        <w:t xml:space="preserve"> </w:t>
-      </w:r>
-      <w:proofErr w:type="spellStart"/>
-      <w:r>
-        <w:rPr>
-          <w:rFonts w:eastAsia="Times New Roman" w:cs="Times New Roman"/>
-          <w:kern w:val="0"/>
-          <w:lang w:eastAsia="pt-PT"/>
-          <w14:ligatures w14:val="none"/>
-        </w:rPr>
-        <w:t>Task</w:t>
-      </w:r>
-      <w:proofErr w:type="spellEnd"/>
-      <w:r>
-        <w:rPr>
-          <w:rFonts w:eastAsia="Times New Roman" w:cs="Times New Roman"/>
-          <w:kern w:val="0"/>
-          <w:lang w:eastAsia="pt-PT"/>
-          <w14:ligatures w14:val="none"/>
-        </w:rPr>
-        <w:t xml:space="preserve"> Force (IETF).</w:t>
+        <w:t>. Internet Engineering Task Force (IETF).</w:t>
       </w:r>
     </w:p>
     <w:p>
@@ -3401,69 +2738,8 @@
           <w:lang w:eastAsia="pt-PT"/>
           <w14:ligatures w14:val="none"/>
         </w:rPr>
-        <w:t>TOTP: Time-</w:t>
-      </w:r>
-      <w:proofErr w:type="spellStart"/>
-      <w:r>
-        <w:rPr>
-          <w:rFonts w:eastAsia="Times New Roman" w:cs="Times New Roman"/>
-          <w:i/>
-          <w:iCs/>
-          <w:kern w:val="0"/>
-          <w:lang w:eastAsia="pt-PT"/>
-          <w14:ligatures w14:val="none"/>
-        </w:rPr>
-        <w:t>Based</w:t>
-      </w:r>
-      <w:proofErr w:type="spellEnd"/>
-      <w:r>
-        <w:rPr>
-          <w:rFonts w:eastAsia="Times New Roman" w:cs="Times New Roman"/>
-          <w:i/>
-          <w:iCs/>
-          <w:kern w:val="0"/>
-          <w:lang w:eastAsia="pt-PT"/>
-          <w14:ligatures w14:val="none"/>
-        </w:rPr>
-        <w:t xml:space="preserve"> </w:t>
-      </w:r>
-      <w:proofErr w:type="spellStart"/>
-      <w:r>
-        <w:rPr>
-          <w:rFonts w:eastAsia="Times New Roman" w:cs="Times New Roman"/>
-          <w:i/>
-          <w:iCs/>
-          <w:kern w:val="0"/>
-          <w:lang w:eastAsia="pt-PT"/>
-          <w14:ligatures w14:val="none"/>
-        </w:rPr>
-        <w:t>One</w:t>
-      </w:r>
-      <w:proofErr w:type="spellEnd"/>
-      <w:r>
-        <w:rPr>
-          <w:rFonts w:eastAsia="Times New Roman" w:cs="Times New Roman"/>
-          <w:i/>
-          <w:iCs/>
-          <w:kern w:val="0"/>
-          <w:lang w:eastAsia="pt-PT"/>
-          <w14:ligatures w14:val="none"/>
-        </w:rPr>
-        <w:t xml:space="preserve">-Time Password </w:t>
-      </w:r>
-      <w:proofErr w:type="spellStart"/>
-      <w:r>
-        <w:rPr>
-          <w:rFonts w:eastAsia="Times New Roman" w:cs="Times New Roman"/>
-          <w:i/>
-          <w:iCs/>
-          <w:kern w:val="0"/>
-          <w:lang w:eastAsia="pt-PT"/>
-          <w14:ligatures w14:val="none"/>
-        </w:rPr>
-        <w:t>Algorithm</w:t>
-      </w:r>
-      <w:proofErr w:type="spellEnd"/>
+        <w:t>TOTP: Time-Based One-Time Password Algorithm</w:t>
+      </w:r>
       <w:r>
         <w:rPr>
           <w:rFonts w:eastAsia="Times New Roman" w:cs="Times New Roman"/>
@@ -3471,47 +2747,7 @@
           <w:lang w:eastAsia="pt-PT"/>
           <w14:ligatures w14:val="none"/>
         </w:rPr>
-        <w:t xml:space="preserve">. Internet </w:t>
-      </w:r>
-      <w:proofErr w:type="spellStart"/>
-      <w:r>
-        <w:rPr>
-          <w:rFonts w:eastAsia="Times New Roman" w:cs="Times New Roman"/>
-          <w:kern w:val="0"/>
-          <w:lang w:eastAsia="pt-PT"/>
-          <w14:ligatures w14:val="none"/>
-        </w:rPr>
-        <w:t>Engineering</w:t>
-      </w:r>
-      <w:proofErr w:type="spellEnd"/>
-      <w:r>
-        <w:rPr>
-          <w:rFonts w:eastAsia="Times New Roman" w:cs="Times New Roman"/>
-          <w:kern w:val="0"/>
-          <w:lang w:eastAsia="pt-PT"/>
-          <w14:ligatures w14:val="none"/>
-        </w:rPr>
-        <w:t xml:space="preserve"> </w:t>
-      </w:r>
-      <w:proofErr w:type="spellStart"/>
-      <w:r>
-        <w:rPr>
-          <w:rFonts w:eastAsia="Times New Roman" w:cs="Times New Roman"/>
-          <w:kern w:val="0"/>
-          <w:lang w:eastAsia="pt-PT"/>
-          <w14:ligatures w14:val="none"/>
-        </w:rPr>
-        <w:t>Task</w:t>
-      </w:r>
-      <w:proofErr w:type="spellEnd"/>
-      <w:r>
-        <w:rPr>
-          <w:rFonts w:eastAsia="Times New Roman" w:cs="Times New Roman"/>
-          <w:kern w:val="0"/>
-          <w:lang w:eastAsia="pt-PT"/>
-          <w14:ligatures w14:val="none"/>
-        </w:rPr>
-        <w:t xml:space="preserve"> Force (IETF).</w:t>
+        <w:t>. Internet Engineering Task Force (IETF).</w:t>
       </w:r>
     </w:p>
     <w:p>
@@ -3591,127 +2827,7 @@
           <w:lang w:eastAsia="pt-PT"/>
           <w14:ligatures w14:val="none"/>
         </w:rPr>
-        <w:t xml:space="preserve">Digital </w:t>
-      </w:r>
-      <w:proofErr w:type="spellStart"/>
-      <w:r>
-        <w:rPr>
-          <w:rFonts w:eastAsia="Times New Roman" w:cs="Times New Roman"/>
-          <w:i/>
-          <w:iCs/>
-          <w:kern w:val="0"/>
-          <w:lang w:eastAsia="pt-PT"/>
-          <w14:ligatures w14:val="none"/>
-        </w:rPr>
-        <w:t>Identity</w:t>
-      </w:r>
-      <w:proofErr w:type="spellEnd"/>
-      <w:r>
-        <w:rPr>
-          <w:rFonts w:eastAsia="Times New Roman" w:cs="Times New Roman"/>
-          <w:i/>
-          <w:iCs/>
-          <w:kern w:val="0"/>
-          <w:lang w:eastAsia="pt-PT"/>
-          <w14:ligatures w14:val="none"/>
-        </w:rPr>
-        <w:t xml:space="preserve"> </w:t>
-      </w:r>
-      <w:proofErr w:type="spellStart"/>
-      <w:r>
-        <w:rPr>
-          <w:rFonts w:eastAsia="Times New Roman" w:cs="Times New Roman"/>
-          <w:i/>
-          <w:iCs/>
-          <w:kern w:val="0"/>
-          <w:lang w:eastAsia="pt-PT"/>
-          <w14:ligatures w14:val="none"/>
-        </w:rPr>
-        <w:t>Guidelines</w:t>
-      </w:r>
-      <w:proofErr w:type="spellEnd"/>
-      <w:r>
-        <w:rPr>
-          <w:rFonts w:eastAsia="Times New Roman" w:cs="Times New Roman"/>
-          <w:i/>
-          <w:iCs/>
-          <w:kern w:val="0"/>
-          <w:lang w:eastAsia="pt-PT"/>
-          <w14:ligatures w14:val="none"/>
-        </w:rPr>
-        <w:t xml:space="preserve">: </w:t>
-      </w:r>
-      <w:proofErr w:type="spellStart"/>
-      <w:r>
-        <w:rPr>
-          <w:rFonts w:eastAsia="Times New Roman" w:cs="Times New Roman"/>
-          <w:i/>
-          <w:iCs/>
-          <w:kern w:val="0"/>
-          <w:lang w:eastAsia="pt-PT"/>
-          <w14:ligatures w14:val="none"/>
-        </w:rPr>
-        <w:t>Authentication</w:t>
-      </w:r>
-      <w:proofErr w:type="spellEnd"/>
-      <w:r>
-        <w:rPr>
-          <w:rFonts w:eastAsia="Times New Roman" w:cs="Times New Roman"/>
-          <w:i/>
-          <w:iCs/>
-          <w:kern w:val="0"/>
-          <w:lang w:eastAsia="pt-PT"/>
-          <w14:ligatures w14:val="none"/>
-        </w:rPr>
-        <w:t xml:space="preserve"> </w:t>
-      </w:r>
-      <w:proofErr w:type="spellStart"/>
-      <w:r>
-        <w:rPr>
-          <w:rFonts w:eastAsia="Times New Roman" w:cs="Times New Roman"/>
-          <w:i/>
-          <w:iCs/>
-          <w:kern w:val="0"/>
-          <w:lang w:eastAsia="pt-PT"/>
-          <w14:ligatures w14:val="none"/>
-        </w:rPr>
-        <w:t>and</w:t>
-      </w:r>
-      <w:proofErr w:type="spellEnd"/>
-      <w:r>
-        <w:rPr>
-          <w:rFonts w:eastAsia="Times New Roman" w:cs="Times New Roman"/>
-          <w:i/>
-          <w:iCs/>
-          <w:kern w:val="0"/>
-          <w:lang w:eastAsia="pt-PT"/>
-          <w14:ligatures w14:val="none"/>
-        </w:rPr>
-        <w:t xml:space="preserve"> </w:t>
-      </w:r>
-      <w:proofErr w:type="spellStart"/>
-      <w:r>
-        <w:rPr>
-          <w:rFonts w:eastAsia="Times New Roman" w:cs="Times New Roman"/>
-          <w:i/>
-          <w:iCs/>
-          <w:kern w:val="0"/>
-          <w:lang w:eastAsia="pt-PT"/>
-          <w14:ligatures w14:val="none"/>
-        </w:rPr>
-        <w:t>Lifecycle</w:t>
-      </w:r>
-      <w:proofErr w:type="spellEnd"/>
-      <w:r>
-        <w:rPr>
-          <w:rFonts w:eastAsia="Times New Roman" w:cs="Times New Roman"/>
-          <w:i/>
-          <w:iCs/>
-          <w:kern w:val="0"/>
-          <w:lang w:eastAsia="pt-PT"/>
-          <w14:ligatures w14:val="none"/>
-        </w:rPr>
-        <w:t xml:space="preserve"> Management</w:t>
+        <w:t>Digital Identity Guidelines: Authentication and Lifecycle Management</w:t>
       </w:r>
       <w:r>
         <w:rPr>
@@ -3720,107 +2836,7 @@
           <w:lang w:eastAsia="pt-PT"/>
           <w14:ligatures w14:val="none"/>
         </w:rPr>
-        <w:t xml:space="preserve">. </w:t>
-      </w:r>
-      <w:proofErr w:type="spellStart"/>
-      <w:r>
-        <w:rPr>
-          <w:rFonts w:eastAsia="Times New Roman" w:cs="Times New Roman"/>
-          <w:kern w:val="0"/>
-          <w:lang w:eastAsia="pt-PT"/>
-          <w14:ligatures w14:val="none"/>
-        </w:rPr>
-        <w:t>National</w:t>
-      </w:r>
-      <w:proofErr w:type="spellEnd"/>
-      <w:r>
-        <w:rPr>
-          <w:rFonts w:eastAsia="Times New Roman" w:cs="Times New Roman"/>
-          <w:kern w:val="0"/>
-          <w:lang w:eastAsia="pt-PT"/>
-          <w14:ligatures w14:val="none"/>
-        </w:rPr>
-        <w:t xml:space="preserve"> </w:t>
-      </w:r>
-      <w:proofErr w:type="spellStart"/>
-      <w:r>
-        <w:rPr>
-          <w:rFonts w:eastAsia="Times New Roman" w:cs="Times New Roman"/>
-          <w:kern w:val="0"/>
-          <w:lang w:eastAsia="pt-PT"/>
-          <w14:ligatures w14:val="none"/>
-        </w:rPr>
-        <w:t>Institute</w:t>
-      </w:r>
-      <w:proofErr w:type="spellEnd"/>
-      <w:r>
-        <w:rPr>
-          <w:rFonts w:eastAsia="Times New Roman" w:cs="Times New Roman"/>
-          <w:kern w:val="0"/>
-          <w:lang w:eastAsia="pt-PT"/>
-          <w14:ligatures w14:val="none"/>
-        </w:rPr>
-        <w:t xml:space="preserve"> </w:t>
-      </w:r>
-      <w:proofErr w:type="spellStart"/>
-      <w:r>
-        <w:rPr>
-          <w:rFonts w:eastAsia="Times New Roman" w:cs="Times New Roman"/>
-          <w:kern w:val="0"/>
-          <w:lang w:eastAsia="pt-PT"/>
-          <w14:ligatures w14:val="none"/>
-        </w:rPr>
-        <w:t>of</w:t>
-      </w:r>
-      <w:proofErr w:type="spellEnd"/>
-      <w:r>
-        <w:rPr>
-          <w:rFonts w:eastAsia="Times New Roman" w:cs="Times New Roman"/>
-          <w:kern w:val="0"/>
-          <w:lang w:eastAsia="pt-PT"/>
-          <w14:ligatures w14:val="none"/>
-        </w:rPr>
-        <w:t xml:space="preserve"> Standards </w:t>
-      </w:r>
-      <w:proofErr w:type="spellStart"/>
-      <w:r>
-        <w:rPr>
-          <w:rFonts w:eastAsia="Times New Roman" w:cs="Times New Roman"/>
-          <w:kern w:val="0"/>
-          <w:lang w:eastAsia="pt-PT"/>
-          <w14:ligatures w14:val="none"/>
-        </w:rPr>
-        <w:t>and</w:t>
-      </w:r>
-      <w:proofErr w:type="spellEnd"/>
-      <w:r>
-        <w:rPr>
-          <w:rFonts w:eastAsia="Times New Roman" w:cs="Times New Roman"/>
-          <w:kern w:val="0"/>
-          <w:lang w:eastAsia="pt-PT"/>
-          <w14:ligatures w14:val="none"/>
-        </w:rPr>
-        <w:t xml:space="preserve"> </w:t>
-      </w:r>
-      <w:proofErr w:type="spellStart"/>
-      <w:r>
-        <w:rPr>
-          <w:rFonts w:eastAsia="Times New Roman" w:cs="Times New Roman"/>
-          <w:kern w:val="0"/>
-          <w:lang w:eastAsia="pt-PT"/>
-          <w14:ligatures w14:val="none"/>
-        </w:rPr>
-        <w:t>Technology</w:t>
-      </w:r>
-      <w:proofErr w:type="spellEnd"/>
-      <w:r>
-        <w:rPr>
-          <w:rFonts w:eastAsia="Times New Roman" w:cs="Times New Roman"/>
-          <w:kern w:val="0"/>
-          <w:lang w:eastAsia="pt-PT"/>
-          <w14:ligatures w14:val="none"/>
-        </w:rPr>
-        <w:t>.</w:t>
+        <w:t>. National Institute of Standards and Technology.</w:t>
       </w:r>
     </w:p>
     <w:p>
@@ -3969,21 +2985,8 @@
           <w:lang w:eastAsia="pt-PT"/>
           <w14:ligatures w14:val="none"/>
         </w:rPr>
-        <w:t xml:space="preserve">FIDO </w:t>
-      </w:r>
-      <w:proofErr w:type="spellStart"/>
-      <w:r>
-        <w:rPr>
-          <w:rFonts w:eastAsia="Times New Roman" w:cs="Times New Roman"/>
-          <w:b/>
-          <w:bCs/>
-          <w:kern w:val="0"/>
-          <w:lang w:eastAsia="pt-PT"/>
-          <w14:ligatures w14:val="none"/>
-        </w:rPr>
-        <w:t>Alliance</w:t>
-      </w:r>
-      <w:proofErr w:type="spellEnd"/>
+        <w:t>FIDO Alliance</w:t>
+      </w:r>
       <w:r>
         <w:rPr>
           <w:rFonts w:eastAsia="Times New Roman" w:cs="Times New Roman"/>
@@ -4002,45 +3005,8 @@
           <w:lang w:eastAsia="pt-PT"/>
           <w14:ligatures w14:val="none"/>
         </w:rPr>
-        <w:t xml:space="preserve">FIDO2: </w:t>
-      </w:r>
-      <w:proofErr w:type="spellStart"/>
-      <w:r>
-        <w:rPr>
-          <w:rFonts w:eastAsia="Times New Roman" w:cs="Times New Roman"/>
-          <w:i/>
-          <w:iCs/>
-          <w:kern w:val="0"/>
-          <w:lang w:eastAsia="pt-PT"/>
-          <w14:ligatures w14:val="none"/>
-        </w:rPr>
-        <w:t>WebAuthn</w:t>
-      </w:r>
-      <w:proofErr w:type="spellEnd"/>
-      <w:r>
-        <w:rPr>
-          <w:rFonts w:eastAsia="Times New Roman" w:cs="Times New Roman"/>
-          <w:i/>
-          <w:iCs/>
-          <w:kern w:val="0"/>
-          <w:lang w:eastAsia="pt-PT"/>
-          <w14:ligatures w14:val="none"/>
-        </w:rPr>
-        <w:t xml:space="preserve"> &amp; CTAP </w:t>
-      </w:r>
-      <w:proofErr w:type="spellStart"/>
-      <w:r>
-        <w:rPr>
-          <w:rFonts w:eastAsia="Times New Roman" w:cs="Times New Roman"/>
-          <w:i/>
-          <w:iCs/>
-          <w:kern w:val="0"/>
-          <w:lang w:eastAsia="pt-PT"/>
-          <w14:ligatures w14:val="none"/>
-        </w:rPr>
-        <w:t>Specifications</w:t>
-      </w:r>
-      <w:proofErr w:type="spellEnd"/>
+        <w:t>FIDO2: WebAuthn &amp; CTAP Specifications</w:t>
+      </w:r>
       <w:r>
         <w:rPr>
           <w:rFonts w:eastAsia="Times New Roman" w:cs="Times New Roman"/>
@@ -4099,7 +3065,6 @@
           <w14:ligatures w14:val="none"/>
         </w:rPr>
       </w:pPr>
-      <w:proofErr w:type="spellStart"/>
       <w:r>
         <w:rPr>
           <w:rFonts w:eastAsia="Times New Roman" w:cs="Times New Roman"/>
@@ -4109,33 +3074,8 @@
           <w:lang w:eastAsia="pt-PT"/>
           <w14:ligatures w14:val="none"/>
         </w:rPr>
-        <w:t>Kaspersky</w:t>
-      </w:r>
-      <w:proofErr w:type="spellEnd"/>
-      <w:r>
-        <w:rPr>
-          <w:rFonts w:eastAsia="Times New Roman" w:cs="Times New Roman"/>
-          <w:b/>
-          <w:bCs/>
-          <w:kern w:val="0"/>
-          <w:lang w:eastAsia="pt-PT"/>
-          <w14:ligatures w14:val="none"/>
-        </w:rPr>
-        <w:t xml:space="preserve"> </w:t>
-      </w:r>
-      <w:proofErr w:type="spellStart"/>
-      <w:r>
-        <w:rPr>
-          <w:rFonts w:eastAsia="Times New Roman" w:cs="Times New Roman"/>
-          <w:b/>
-          <w:bCs/>
-          <w:kern w:val="0"/>
-          <w:lang w:eastAsia="pt-PT"/>
-          <w14:ligatures w14:val="none"/>
-        </w:rPr>
-        <w:t>Lab</w:t>
-      </w:r>
-      <w:proofErr w:type="spellEnd"/>
+        <w:t>Kaspersky Lab</w:t>
+      </w:r>
       <w:r>
         <w:rPr>
           <w:rFonts w:eastAsia="Times New Roman" w:cs="Times New Roman"/>
@@ -4154,115 +3094,7 @@
           <w:lang w:eastAsia="pt-PT"/>
           <w14:ligatures w14:val="none"/>
         </w:rPr>
-        <w:t xml:space="preserve">What </w:t>
-      </w:r>
-      <w:proofErr w:type="spellStart"/>
-      <w:r>
-        <w:rPr>
-          <w:rFonts w:eastAsia="Times New Roman" w:cs="Times New Roman"/>
-          <w:i/>
-          <w:iCs/>
-          <w:kern w:val="0"/>
-          <w:lang w:eastAsia="pt-PT"/>
-          <w14:ligatures w14:val="none"/>
-        </w:rPr>
-        <w:t>is</w:t>
-      </w:r>
-      <w:proofErr w:type="spellEnd"/>
-      <w:r>
-        <w:rPr>
-          <w:rFonts w:eastAsia="Times New Roman" w:cs="Times New Roman"/>
-          <w:i/>
-          <w:iCs/>
-          <w:kern w:val="0"/>
-          <w:lang w:eastAsia="pt-PT"/>
-          <w14:ligatures w14:val="none"/>
-        </w:rPr>
-        <w:t xml:space="preserve"> </w:t>
-      </w:r>
-      <w:proofErr w:type="spellStart"/>
-      <w:r>
-        <w:rPr>
-          <w:rFonts w:eastAsia="Times New Roman" w:cs="Times New Roman"/>
-          <w:i/>
-          <w:iCs/>
-          <w:kern w:val="0"/>
-          <w:lang w:eastAsia="pt-PT"/>
-          <w14:ligatures w14:val="none"/>
-        </w:rPr>
-        <w:t>Two-Factor</w:t>
-      </w:r>
-      <w:proofErr w:type="spellEnd"/>
-      <w:r>
-        <w:rPr>
-          <w:rFonts w:eastAsia="Times New Roman" w:cs="Times New Roman"/>
-          <w:i/>
-          <w:iCs/>
-          <w:kern w:val="0"/>
-          <w:lang w:eastAsia="pt-PT"/>
-          <w14:ligatures w14:val="none"/>
-        </w:rPr>
-        <w:t xml:space="preserve"> </w:t>
-      </w:r>
-      <w:proofErr w:type="spellStart"/>
-      <w:r>
-        <w:rPr>
-          <w:rFonts w:eastAsia="Times New Roman" w:cs="Times New Roman"/>
-          <w:i/>
-          <w:iCs/>
-          <w:kern w:val="0"/>
-          <w:lang w:eastAsia="pt-PT"/>
-          <w14:ligatures w14:val="none"/>
-        </w:rPr>
-        <w:t>Authentication</w:t>
-      </w:r>
-      <w:proofErr w:type="spellEnd"/>
-      <w:r>
-        <w:rPr>
-          <w:rFonts w:eastAsia="Times New Roman" w:cs="Times New Roman"/>
-          <w:i/>
-          <w:iCs/>
-          <w:kern w:val="0"/>
-          <w:lang w:eastAsia="pt-PT"/>
-          <w14:ligatures w14:val="none"/>
-        </w:rPr>
-        <w:t xml:space="preserve"> (2FA) </w:t>
-      </w:r>
-      <w:proofErr w:type="spellStart"/>
-      <w:r>
-        <w:rPr>
-          <w:rFonts w:eastAsia="Times New Roman" w:cs="Times New Roman"/>
-          <w:i/>
-          <w:iCs/>
-          <w:kern w:val="0"/>
-          <w:lang w:eastAsia="pt-PT"/>
-          <w14:ligatures w14:val="none"/>
-        </w:rPr>
-        <w:t>and</w:t>
-      </w:r>
-      <w:proofErr w:type="spellEnd"/>
-      <w:r>
-        <w:rPr>
-          <w:rFonts w:eastAsia="Times New Roman" w:cs="Times New Roman"/>
-          <w:i/>
-          <w:iCs/>
-          <w:kern w:val="0"/>
-          <w:lang w:eastAsia="pt-PT"/>
-          <w14:ligatures w14:val="none"/>
-        </w:rPr>
-        <w:t xml:space="preserve"> How Does It </w:t>
-      </w:r>
-      <w:proofErr w:type="gramStart"/>
-      <w:r>
-        <w:rPr>
-          <w:rFonts w:eastAsia="Times New Roman" w:cs="Times New Roman"/>
-          <w:i/>
-          <w:iCs/>
-          <w:kern w:val="0"/>
-          <w:lang w:eastAsia="pt-PT"/>
-          <w14:ligatures w14:val="none"/>
-        </w:rPr>
-        <w:t>Work?</w:t>
+        <w:t>What is Two-Factor Authentication (2FA) and How Does It Work?</w:t>
       </w:r>
       <w:r>
         <w:rPr>
@@ -4273,7 +3105,6 @@
         </w:rPr>
         <w:t>.</w:t>
       </w:r>
-      <w:proofErr w:type="gramEnd"/>
     </w:p>
     <w:p>
       <w:pPr>

</xml_diff>